<commit_message>
Print packs for six missing sessions
Add Oct12 S2, Oct13 S1, Oct13 S3, Oct14 S2, Oct15 S1 and Oct15 S3 to
make_session_materials.R, in the same format as Lucas's packs:
exercise sheets, an AI Snapshot page, a take-away card and a
facilitator key. Prompts, AI responses and closing questions are
copied from the decks; every number is computed from the CSVs.
Oct12 S2 and Oct14 S2 print their charts on the AI page.

Oct15 S1's rating sheet and Oct15 S3's design template now live in
their packs and read qa_rating.R and qa_design_update.R; the old
.qmd sources are retired. Re-render Oct15_session1_report.docx,
which still carried the instrumental-variables version.

Link the six participant copies and the report from docs/index.html.
Update the exercise plan to point at the packs and drop the DOH and
DCD rows. Remove em dashes from qa_rating.R, qa_design_update.R and
the exercise plan. Record the pack workflow and three deck
inconsistencies in CLAUDE.md.
</commit_message>
<xml_diff>
--- a/Module_2_Oct_2026_v2/Module2_exercise_plan_v2.docx
+++ b/Module_2_Oct_2026_v2/Module2_exercise_plan_v2.docx
@@ -8,7 +8,7 @@
         <w:pStyle w:val="Heading1"/>
       </w:pPr>
       <w:r>
-        <w:t xml:space="preserve">Module 2 — Exercise Plan</w:t>
+        <w:t>Module 2: Exercise Plan</w:t>
       </w:r>
     </w:p>
     <w:p>
@@ -44,20 +44,15 @@
         <w:pStyle w:val="BodyText"/>
       </w:pPr>
       <w:r>
-        <w:t xml:space="preserve">Still awaiting real case data: Oct 13 S1 (DOH) and Oct 13 S3 (DCD). Lucas’s six sessions (Oct 12 S1 and S3, Oct 13 S2, Oct 14 S1 and S3, Oct 15 S2) were revised on 25 Sep for the live decks; each uses one example only, so their Abu Dhabi case slots are dropped, and their print materials are built (one Word pack per session, generated by</w:t>
-      </w:r>
-      <w:r>
-        <w:t xml:space="preserve"> </w:t>
-      </w:r>
+        <w:t>All twelve sessions now have print materials: one Word pack per session, generated by make_session_materials.R. Lucas’s six sessions (Oct 12 S1 and S3, Oct 13 S2, Oct 14 S1 and S3, Oct 15 S2) were revised on 25 Sep for the live decks. Fiona’s six (Oct 12 S2, Oct 13 S1 and S3, Oct 14 S2, Oct 15 S1 and S3) were given their packs on 25 Sep. Every session uses one example only, so the Abu Dhabi DOH and DCD case slots are dropped.</w:t>
+      </w:r>
+      <w:r/>
       <w:r>
         <w:rPr>
           <w:rStyle w:val="VerbatimChar"/>
         </w:rPr>
-        <w:t xml:space="preserve">make_session_materials.R</w:t>
-      </w:r>
-      <w:r>
-        <w:t xml:space="preserve">). The other six sections are unchanged from Fiona’s 24 Sep version.</w:t>
-      </w:r>
+      </w:r>
+      <w:r/>
     </w:p>
     <w:p>
       <w:r>
@@ -72,7 +67,7 @@
         <w:pStyle w:val="Heading2"/>
       </w:pPr>
       <w:r>
-        <w:t xml:space="preserve">Oct 12, Session 1 — Compared to What? (Know the Language First)</w:t>
+        <w:t>Oct 12, Session 1: Compared to What? (Know the Language First)</w:t>
       </w:r>
     </w:p>
     <w:p>
@@ -918,7 +913,7 @@
         <w:pStyle w:val="Heading2"/>
       </w:pPr>
       <w:r>
-        <w:t xml:space="preserve">Oct 12, Session 2 — What Do the Numbers Say? (Illustrative Traffic-Camera Case)</w:t>
+        <w:t>Oct 12, Session 2: What Do the Numbers Say? (Illustrative Traffic-Camera Case)</w:t>
       </w:r>
     </w:p>
     <w:p>
@@ -930,56 +925,49 @@
           <w:i/>
           <w:iCs/>
         </w:rPr>
-        <w:t xml:space="preserve">Revised 24 Sep. Runs on a fictional automated-speed-camera dataset (the case names no real body); every figure carries an illustrative-data disclaimer. The session is now descriptive and run live: the trainer runs R in the browser (webR, needs internet) to open the data, graph it and measure the before-and-after change in camera sectors, using the Session 1 vocabulary. It ends on</w:t>
-      </w:r>
-      <w:r>
-        <w:rPr>
-          <w:i/>
-          <w:iCs/>
-        </w:rPr>
-        <w:t xml:space="preserve"> </w:t>
-      </w:r>
-      <w:r>
-        <w:rPr>
-          <w:i/>
-          <w:iCs/>
-        </w:rPr>
-        <w:t xml:space="preserve">“compared to what?”</w:t>
-      </w:r>
-      <w:r>
-        <w:rPr>
-          <w:i/>
-          <w:iCs/>
-        </w:rPr>
-        <w:t xml:space="preserve"> </w:t>
-      </w:r>
-      <w:r>
-        <w:rPr>
-          <w:i/>
-          <w:iCs/>
-        </w:rPr>
-        <w:t xml:space="preserve">and hands over to Session 3. The case is not reused in later sessions. The old AI Snapshot (</w:t>
-      </w:r>
-      <w:r>
-        <w:rPr>
-          <w:i/>
-          <w:iCs/>
-        </w:rPr>
-        <w:t xml:space="preserve">“three sentences for a decision-maker”</w:t>
-      </w:r>
-      <w:r>
-        <w:rPr>
-          <w:i/>
-          <w:iCs/>
-        </w:rPr>
-        <w:t xml:space="preserve"> </w:t>
-      </w:r>
-      <w:r>
-        <w:rPr>
-          <w:i/>
-          <w:iCs/>
-        </w:rPr>
-        <w:t xml:space="preserve">on a DiD table) is replaced by the chart exercise below, and the annotate handout now uses the before-and-after regression output.</w:t>
+        <w:t>Revised 24 Sep. Runs on a fictional automated-speed-camera dataset (the case names no real body); every figure carries an illustrative-data disclaimer. The session is now descriptive and run live: the trainer runs R in the browser (webR, needs internet) to open the data, graph it and measure the before-and-after change in camera sectors, using the Session 1 vocabulary. It ends on “compared to what?” and hands over to Session 3. The case is not reused in later sessions. The old AI Snapshot (“three sentences for a decision-maker” on a DiD table) is replaced by the chart exercise below, and the annotate handout now uses the before-and-after regression output. Print materials are in Oct12_session2_materials.docx, generated by make_session_materials.R from the same data as the deck; each item opens with a print line (copies, cut or not) and the last page is the facilitator key. Participant copies, without the key, are on the course website.</w:t>
+      </w:r>
+      <w:r>
+        <w:rPr>
+          <w:i/>
+          <w:iCs/>
+        </w:rPr>
+      </w:r>
+      <w:r>
+        <w:rPr>
+          <w:i/>
+          <w:iCs/>
+        </w:rPr>
+      </w:r>
+      <w:r>
+        <w:rPr>
+          <w:i/>
+          <w:iCs/>
+        </w:rPr>
+      </w:r>
+      <w:r>
+        <w:rPr>
+          <w:i/>
+          <w:iCs/>
+        </w:rPr>
+      </w:r>
+      <w:r>
+        <w:rPr>
+          <w:i/>
+          <w:iCs/>
+        </w:rPr>
+      </w:r>
+      <w:r>
+        <w:rPr>
+          <w:i/>
+          <w:iCs/>
+        </w:rPr>
+      </w:r>
+      <w:r>
+        <w:rPr>
+          <w:i/>
+          <w:iCs/>
+        </w:rPr>
       </w:r>
     </w:p>
     <w:tbl>
@@ -1083,7 +1071,7 @@
               <w:jc w:val="left"/>
             </w:pPr>
             <w:r>
-              <w:t xml:space="preserve">Commitment poll —</w:t>
+              <w:t>Commitment poll:</w:t>
             </w:r>
             <w:r>
               <w:t xml:space="preserve"> </w:t>
@@ -1190,7 +1178,7 @@
               <w:jc w:val="left"/>
             </w:pPr>
             <w:r>
-              <w:t xml:space="preserve">Call the number — live-code predictions</w:t>
+              <w:t>Call the number: live-code predictions</w:t>
             </w:r>
           </w:p>
         </w:tc>
@@ -1279,7 +1267,7 @@
               <w:jc w:val="left"/>
             </w:pPr>
             <w:r>
-              <w:t xml:space="preserve">AI Snapshot — ask AI to read the chart</w:t>
+              <w:t>AI Snapshot: ask AI to read the chart</w:t>
             </w:r>
           </w:p>
         </w:tc>
@@ -1339,61 +1327,41 @@
               <w:jc w:val="left"/>
             </w:pPr>
             <w:r>
-              <w:t xml:space="preserve">Printed before-and-after bar chart with the flawed AI answer beneath it, one per pair; two prompt cards; one device with AI access per pair</w:t>
-            </w:r>
-          </w:p>
-        </w:tc>
-        <w:tc>
-          <w:tcPr/>
-          <w:p>
-            <w:pPr>
-              <w:pStyle w:val="Compact"/>
-              <w:jc w:val="left"/>
-            </w:pPr>
-            <w:r>
-              <w:t xml:space="preserve">(1) Pairs mark up the illustrative AI answer to</w:t>
-            </w:r>
-            <w:r>
-              <w:t xml:space="preserve"> </w:t>
-            </w:r>
-            <w:r>
-              <w:t xml:space="preserve">“What does this chart show? Did the cameras work?”</w:t>
-            </w:r>
-            <w:r>
-              <w:t xml:space="preserve">. Planted errors: an invented p-value, a causal claim from a before-and-after chart, an invented</w:t>
-            </w:r>
-            <w:r>
-              <w:t xml:space="preserve"> </w:t>
-            </w:r>
-            <w:r>
-              <w:t xml:space="preserve">“consistent across all road types”</w:t>
-            </w:r>
-            <w:r>
-              <w:t xml:space="preserve">, and a recommendation with no rule or comparison. (2) Pairs run the short prompt and the better prompt (on the</w:t>
-            </w:r>
-            <w:r>
-              <w:t xml:space="preserve"> </w:t>
-            </w:r>
-            <w:r>
-              <w:t xml:space="preserve">“A better prompt”</w:t>
-            </w:r>
-            <w:r>
-              <w:t xml:space="preserve"> </w:t>
-            </w:r>
-            <w:r>
-              <w:t xml:space="preserve">slide) on a photo of the chart and compare. Card text is on the slides. Swap in a real captured AI answer if Fiona gets one.</w:t>
-            </w:r>
-          </w:p>
-        </w:tc>
-        <w:tc>
-          <w:tcPr/>
-          <w:p>
-            <w:pPr>
-              <w:pStyle w:val="Compact"/>
-              <w:jc w:val="left"/>
-            </w:pPr>
-            <w:r>
-              <w:t xml:space="preserve">Handout + cards to build</w:t>
+              <w:t>AI handout with the chart (pack page 2), 1 per pair; one device with AI access per pair</w:t>
+            </w:r>
+          </w:p>
+        </w:tc>
+        <w:tc>
+          <w:tcPr/>
+          <w:p>
+            <w:pPr>
+              <w:pStyle w:val="Compact"/>
+              <w:jc w:val="left"/>
+            </w:pPr>
+            <w:r>
+              <w:t>(1) Pairs mark up the illustrative AI answer to “What does this chart show? Did the cameras work?”. Planted errors: an invented p-value, a causal claim from a before-and-after chart, an invented “consistent across all road types”, and a recommendation with no rule or comparison. (2) Pairs run the better prompt from the handout on a photo of the chart, compare, then paste the second answer into a fresh chat to check it. Print only.</w:t>
+            </w:r>
+            <w:r/>
+            <w:r/>
+            <w:r/>
+            <w:r/>
+            <w:r/>
+            <w:r/>
+            <w:r/>
+            <w:r/>
+            <w:r/>
+            <w:r/>
+          </w:p>
+        </w:tc>
+        <w:tc>
+          <w:tcPr/>
+          <w:p>
+            <w:pPr>
+              <w:pStyle w:val="Compact"/>
+              <w:jc w:val="left"/>
+            </w:pPr>
+            <w:r>
+              <w:t>Built: print</w:t>
             </w:r>
           </w:p>
         </w:tc>
@@ -1535,31 +1503,107 @@
               <w:jc w:val="left"/>
             </w:pPr>
             <w:r>
-              <w:t xml:space="preserve">Printed regression output, one per participant</w:t>
-            </w:r>
-          </w:p>
-        </w:tc>
-        <w:tc>
-          <w:tcPr/>
-          <w:p>
-            <w:pPr>
-              <w:pStyle w:val="Compact"/>
-              <w:jc w:val="left"/>
-            </w:pPr>
-            <w:r>
-              <w:t xml:space="preserve">One-page handout with the before-and-after regression table (camera sectors only; rows (Intercept) and round; columns Estimate, Std. Error, p-value, CI Lower, CI Upper; values on the slide) and four tasks: circle the change, box its confidence interval, underline the 2019 average and say why it is not an effect, write the comparison you would ask the evaluator for.</w:t>
-            </w:r>
-          </w:p>
-        </w:tc>
-        <w:tc>
-          <w:tcPr/>
-          <w:p>
-            <w:pPr>
-              <w:pStyle w:val="Compact"/>
-              <w:jc w:val="left"/>
-            </w:pPr>
-            <w:r>
-              <w:t xml:space="preserve">Handout to build</w:t>
+              <w:t>Annotate sheet (pack page 1), 1 per participant</w:t>
+            </w:r>
+          </w:p>
+        </w:tc>
+        <w:tc>
+          <w:tcPr/>
+          <w:p>
+            <w:pPr>
+              <w:pStyle w:val="Compact"/>
+              <w:jc w:val="left"/>
+            </w:pPr>
+            <w:r>
+              <w:t>The before-and-after regression table (camera sectors only) with the slide’s four tasks: circle the change, box its confidence interval, underline the 2019 average and say why it is not an effect, write the comparison you would ask the evaluator for. Print only.</w:t>
+            </w:r>
+          </w:p>
+        </w:tc>
+        <w:tc>
+          <w:tcPr/>
+          <w:p>
+            <w:pPr>
+              <w:pStyle w:val="Compact"/>
+              <w:jc w:val="left"/>
+            </w:pPr>
+            <w:r>
+              <w:t>Built: print</w:t>
+            </w:r>
+          </w:p>
+        </w:tc>
+      </w:tr>
+      <w:tr>
+        <w:tc>
+          <w:tcPr/>
+          <w:p>
+            <w:pPr>
+              <w:pStyle w:val="Compact"/>
+              <w:jc w:val="left"/>
+            </w:pPr>
+            <w:r>
+              <w:t>Take-away card: three questions</w:t>
+            </w:r>
+          </w:p>
+        </w:tc>
+        <w:tc>
+          <w:tcPr/>
+          <w:p>
+            <w:pPr>
+              <w:pStyle w:val="Compact"/>
+              <w:jc w:val="left"/>
+            </w:pPr>
+            <w:r>
+              <w:t>~1:25 · Section 7, “Three questions to ask the evaluator”</w:t>
+            </w:r>
+            <w:r/>
+            <w:r/>
+          </w:p>
+        </w:tc>
+        <w:tc>
+          <w:tcPr/>
+          <w:p>
+            <w:pPr>
+              <w:pStyle w:val="Compact"/>
+              <w:jc w:val="left"/>
+            </w:pPr>
+            <w:r>
+              <w:t>Handout (take-away)</w:t>
+            </w:r>
+          </w:p>
+        </w:tc>
+        <w:tc>
+          <w:tcPr/>
+          <w:p>
+            <w:pPr>
+              <w:pStyle w:val="Compact"/>
+              <w:jc w:val="left"/>
+            </w:pPr>
+            <w:r>
+              <w:t>Take-away card (pack page 3), 1 per participant, cut</w:t>
+            </w:r>
+          </w:p>
+        </w:tc>
+        <w:tc>
+          <w:tcPr/>
+          <w:p>
+            <w:pPr>
+              <w:pStyle w:val="Compact"/>
+              <w:jc w:val="left"/>
+            </w:pPr>
+            <w:r>
+              <w:t>The closing slide’s three questions (how big, how sure, compared to what), six cards per page. Print only.</w:t>
+            </w:r>
+          </w:p>
+        </w:tc>
+        <w:tc>
+          <w:tcPr/>
+          <w:p>
+            <w:pPr>
+              <w:pStyle w:val="Compact"/>
+              <w:jc w:val="left"/>
+            </w:pPr>
+            <w:r>
+              <w:t>Built: print</w:t>
             </w:r>
           </w:p>
         </w:tc>
@@ -1579,7 +1623,7 @@
         <w:pStyle w:val="Heading2"/>
       </w:pPr>
       <w:r>
-        <w:t xml:space="preserve">Oct 12, Session 3 — Spot the Problem (Naive Comparisons and RCT Reading)</w:t>
+        <w:t>Oct 12, Session 3: Spot the Problem (Naive Comparisons and RCT Reading)</w:t>
       </w:r>
     </w:p>
     <w:p>
@@ -2490,7 +2534,83 @@
         <w:pStyle w:val="Heading2"/>
       </w:pPr>
       <w:r>
-        <w:t xml:space="preserve">Oct 13, Session 1 — Reading DiD Results (Abu Dhabi DOH)</w:t>
+        <w:t>Oct 13, Session 1: Reading DiD Results (GreenWaste)</w:t>
+      </w:r>
+    </w:p>
+    <w:p>
+      <w:pPr>
+        <w:pStyle w:val="FirstParagraph"/>
+      </w:pPr>
+      <w:r>
+        <w:rPr>
+          <w:i/>
+          <w:iCs/>
+        </w:rPr>
+        <w:t>Revised 25 Sep: GreenWaste only (the Abu Dhabi DOH case was dropped). Print materials are in Oct13_session1_materials.docx, generated by make_session_materials.R from the same data as the deck; each item opens with a print line (copies, cut or not) and the last page is the facilitator key. Participant copies, without the key, are on the course website.</w:t>
+      </w:r>
+      <w:r>
+        <w:rPr>
+          <w:rStyle w:val="VerbatimChar"/>
+          <w:i/>
+          <w:iCs/>
+        </w:rPr>
+      </w:r>
+      <w:r>
+        <w:rPr>
+          <w:i/>
+          <w:iCs/>
+        </w:rPr>
+      </w:r>
+      <w:r>
+        <w:rPr>
+          <w:i/>
+          <w:iCs/>
+        </w:rPr>
+      </w:r>
+      <w:r>
+        <w:rPr>
+          <w:rStyle w:val="VerbatimChar"/>
+          <w:i/>
+          <w:iCs/>
+        </w:rPr>
+      </w:r>
+      <w:r>
+        <w:rPr>
+          <w:i/>
+          <w:iCs/>
+        </w:rPr>
+      </w:r>
+      <w:r>
+        <w:rPr>
+          <w:i/>
+          <w:iCs/>
+        </w:rPr>
+      </w:r>
+      <w:r>
+        <w:rPr>
+          <w:rStyle w:val="VerbatimChar"/>
+          <w:i/>
+          <w:iCs/>
+        </w:rPr>
+      </w:r>
+      <w:r>
+        <w:rPr>
+          <w:i/>
+          <w:iCs/>
+        </w:rPr>
+      </w:r>
+      <w:r>
+        <w:rPr>
+          <w:i/>
+          <w:iCs/>
+        </w:rPr>
+      </w:r>
+      <w:r/>
+      <w:r>
+        <w:rPr>
+          <w:i/>
+          <w:iCs/>
+        </w:rPr>
       </w:r>
     </w:p>
     <w:tbl>
@@ -2594,7 +2714,7 @@
               <w:jc w:val="left"/>
             </w:pPr>
             <w:r>
-              <w:t xml:space="preserve">Opening poll —</w:t>
+              <w:t>Opening poll:</w:t>
             </w:r>
             <w:r>
               <w:t xml:space="preserve"> </w:t>
@@ -2734,40 +2854,34 @@
               <w:jc w:val="left"/>
             </w:pPr>
             <w:r>
-              <w:t xml:space="preserve">Printed</w:t>
-            </w:r>
-            <w:r>
-              <w:t xml:space="preserve"> </w:t>
-            </w:r>
-            <w:r>
-              <w:t xml:space="preserve">“four-numbers card”</w:t>
-            </w:r>
-            <w:r>
-              <w:t xml:space="preserve">, one per participant</w:t>
-            </w:r>
-          </w:p>
-        </w:tc>
-        <w:tc>
-          <w:tcPr/>
-          <w:p>
-            <w:pPr>
-              <w:pStyle w:val="Compact"/>
-              <w:jc w:val="left"/>
-            </w:pPr>
-            <w:r>
-              <w:t xml:space="preserve">Participants do two subtractions by hand (each group’s change over time, then the difference of the changes) to get the DiD estimate. PwC: design a clean one-page card mirroring the slide’s 2×2, with the Change column and bottom row blank.</w:t>
-            </w:r>
-          </w:p>
-        </w:tc>
-        <w:tc>
-          <w:tcPr/>
-          <w:p>
-            <w:pPr>
-              <w:pStyle w:val="Compact"/>
-              <w:jc w:val="left"/>
-            </w:pPr>
-            <w:r>
-              <w:t xml:space="preserve">Handout to build</w:t>
+              <w:t>Four-numbers sheet (pack page 1), 1 per participant</w:t>
+            </w:r>
+            <w:r/>
+            <w:r/>
+            <w:r/>
+          </w:p>
+        </w:tc>
+        <w:tc>
+          <w:tcPr/>
+          <w:p>
+            <w:pPr>
+              <w:pStyle w:val="Compact"/>
+              <w:jc w:val="left"/>
+            </w:pPr>
+            <w:r>
+              <w:t>Participants do two subtractions by hand (each group’s change over time, then the difference of the changes) to get the DiD estimate, on the slide’s 2×2 with the Change column blank. Print only.</w:t>
+            </w:r>
+          </w:p>
+        </w:tc>
+        <w:tc>
+          <w:tcPr/>
+          <w:p>
+            <w:pPr>
+              <w:pStyle w:val="Compact"/>
+              <w:jc w:val="left"/>
+            </w:pPr>
+            <w:r>
+              <w:t>Built: print</w:t>
             </w:r>
           </w:p>
         </w:tc>
@@ -2829,31 +2943,31 @@
               <w:jc w:val="left"/>
             </w:pPr>
             <w:r>
-              <w:t xml:space="preserve">None, or a Menti poll</w:t>
-            </w:r>
-          </w:p>
-        </w:tc>
-        <w:tc>
-          <w:tcPr/>
-          <w:p>
-            <w:pPr>
-              <w:pStyle w:val="Compact"/>
-              <w:jc w:val="left"/>
-            </w:pPr>
-            <w:r>
-              <w:t xml:space="preserve">After the regression output appears, the room votes on which coefficient is the programme’s effect (the interaction is the answer). PwC: optional Menti MC (Intercept / round / enrolled / round:enrolled).</w:t>
-            </w:r>
-          </w:p>
-        </w:tc>
-        <w:tc>
-          <w:tcPr/>
-          <w:p>
-            <w:pPr>
-              <w:pStyle w:val="Compact"/>
-              <w:jc w:val="left"/>
-            </w:pPr>
-            <w:r>
-              <w:t xml:space="preserve">In slides (verbal); Menti optional</w:t>
+              <w:t>Regression sheet (pack page 2, on the back of the four-numbers sheet); optional Menti</w:t>
+            </w:r>
+          </w:p>
+        </w:tc>
+        <w:tc>
+          <w:tcPr/>
+          <w:p>
+            <w:pPr>
+              <w:pStyle w:val="Compact"/>
+              <w:jc w:val="left"/>
+            </w:pPr>
+            <w:r>
+              <w:t>After the regression output appears, the room votes on which coefficient is the programme’s effect (the interaction is the answer). The sheet repeats the table and asks what the other two rows are and whether the interval clears 1,000 AED. Optional Menti MC (Intercept / round / enrolled / round:enrolled).</w:t>
+            </w:r>
+          </w:p>
+        </w:tc>
+        <w:tc>
+          <w:tcPr/>
+          <w:p>
+            <w:pPr>
+              <w:pStyle w:val="Compact"/>
+              <w:jc w:val="left"/>
+            </w:pPr>
+            <w:r>
+              <w:t>Built: print; Menti optional</w:t>
             </w:r>
           </w:p>
         </w:tc>
@@ -2953,7 +3067,7 @@
               <w:jc w:val="left"/>
             </w:pPr>
             <w:r>
-              <w:t xml:space="preserve">AI Snapshot — main group exercise</w:t>
+              <w:t>AI Snapshot: main group exercise</w:t>
             </w:r>
           </w:p>
         </w:tc>
@@ -2989,43 +3103,35 @@
               <w:jc w:val="left"/>
             </w:pPr>
             <w:r>
-              <w:t xml:space="preserve">Printed flawed AI answer (one per pair); two prompt cards (Prompt A short, Prompt B full); the regression table on the handout; a working AI tool per table</w:t>
-            </w:r>
-          </w:p>
-        </w:tc>
-        <w:tc>
-          <w:tcPr/>
-          <w:p>
-            <w:pPr>
-              <w:pStyle w:val="Compact"/>
-              <w:jc w:val="left"/>
-            </w:pPr>
-            <w:r>
-              <w:t xml:space="preserve">Three parts: (1) mark up the flawed AI answer and find the four planted errors; (2) run the short vs the full prompt on the same table and compare; (3) paste the second answer into a fresh chat and ask it to review. The planted errors escalate this session: a fabricated</w:t>
-            </w:r>
-            <w:r>
-              <w:t xml:space="preserve"> </w:t>
-            </w:r>
-            <w:r>
-              <w:t xml:space="preserve">“parallel trends holds”</w:t>
-            </w:r>
-            <w:r>
-              <w:t xml:space="preserve"> </w:t>
-            </w:r>
-            <w:r>
-              <w:t xml:space="preserve">claim, significant-≠-meets-the-rule, a sign/direction muddle, and the wrong coefficient named as the impact. PwC: produce the printed AI-answer handout plus a facilitator key, the two prompt cards, and a short debrief worksheet. Confirm an AI tool at each table.</w:t>
-            </w:r>
-          </w:p>
-        </w:tc>
-        <w:tc>
-          <w:tcPr/>
-          <w:p>
-            <w:pPr>
-              <w:pStyle w:val="Compact"/>
-              <w:jc w:val="left"/>
-            </w:pPr>
-            <w:r>
-              <w:t xml:space="preserve">Handouts to build (deck refers to them)</w:t>
+              <w:t>AI handout (pack page 3), 1 per pair; a working AI tool per table</w:t>
+            </w:r>
+          </w:p>
+        </w:tc>
+        <w:tc>
+          <w:tcPr/>
+          <w:p>
+            <w:pPr>
+              <w:pStyle w:val="Compact"/>
+              <w:jc w:val="left"/>
+            </w:pPr>
+            <w:r>
+              <w:t>(1) Mark up the flawed AI answer to “Explain this regression table…”. Planted claims: “so the programme was a success” (significant is not the same as meeting the rule), “the interval does not include zero, which confirms the finding is robust”, “the parallel trends assumption has been satisfied” (a test that cannot be run on two waves), and “clears the 1,000 AED threshold” (false). (2) Run the better prompt from the handout, compare, then paste the second answer into a fresh chat to review it. Print only.</w:t>
+            </w:r>
+            <w:r/>
+            <w:r/>
+            <w:r/>
+            <w:r/>
+          </w:p>
+        </w:tc>
+        <w:tc>
+          <w:tcPr/>
+          <w:p>
+            <w:pPr>
+              <w:pStyle w:val="Compact"/>
+              <w:jc w:val="left"/>
+            </w:pPr>
+            <w:r>
+              <w:t>Built: print</w:t>
             </w:r>
           </w:p>
         </w:tc>
@@ -3039,67 +3145,88 @@
               <w:jc w:val="left"/>
             </w:pPr>
             <w:r>
-              <w:t xml:space="preserve">Abu Dhabi DOH case — group exercise</w:t>
-            </w:r>
-          </w:p>
-        </w:tc>
-        <w:tc>
-          <w:tcPr/>
-          <w:p>
-            <w:pPr>
-              <w:pStyle w:val="Compact"/>
-              <w:jc w:val="left"/>
-            </w:pPr>
-            <w:r>
-              <w:t xml:space="preserve">~1:26–1:40 · Section 7</w:t>
-            </w:r>
-          </w:p>
-        </w:tc>
-        <w:tc>
-          <w:tcPr/>
-          <w:p>
-            <w:pPr>
-              <w:pStyle w:val="Compact"/>
-              <w:jc w:val="left"/>
-            </w:pPr>
-            <w:r>
-              <w:t xml:space="preserve">Group work + verdict round</w:t>
-            </w:r>
-          </w:p>
-        </w:tc>
-        <w:tc>
-          <w:tcPr/>
-          <w:p>
-            <w:pPr>
-              <w:pStyle w:val="Compact"/>
-              <w:jc w:val="left"/>
-            </w:pPr>
-            <w:r>
-              <w:t xml:space="preserve">DOH case handout (table + case facts) — pending real DOH findings</w:t>
-            </w:r>
-          </w:p>
-        </w:tc>
-        <w:tc>
-          <w:tcPr/>
-          <w:p>
-            <w:pPr>
-              <w:pStyle w:val="Compact"/>
-              <w:jc w:val="left"/>
-            </w:pPr>
-            <w:r>
-              <w:t xml:space="preserve">Groups read the DOH DiD table using the four reading steps, then a verdict round: act / act with caveats / send back. Placeholder in the slides; structure mirrors the GreenWaste reading.</w:t>
-            </w:r>
-          </w:p>
-        </w:tc>
-        <w:tc>
-          <w:tcPr/>
-          <w:p>
-            <w:pPr>
-              <w:pStyle w:val="Compact"/>
-              <w:jc w:val="left"/>
-            </w:pPr>
-            <w:r>
-              <w:t xml:space="preserve">PLACEHOLDER — awaiting DOH data</w:t>
+              <w:t xml:space="preserve">Ask AI first: questions for the evaluator (OPTIONAL)</w:t>
+            </w:r>
+          </w:p>
+        </w:tc>
+        <w:tc>
+          <w:tcPr/>
+          <w:p>
+            <w:pPr>
+              <w:pStyle w:val="Compact"/>
+              <w:jc w:val="left"/>
+            </w:pPr>
+            <w:r>
+              <w:t xml:space="preserve">~1:25 · Close,</w:t>
+            </w:r>
+            <w:r>
+              <w:t xml:space="preserve"> </w:t>
+            </w:r>
+            <w:r>
+              <w:t xml:space="preserve">“Your turn: ask AI first”</w:t>
+            </w:r>
+            <w:r>
+              <w:t xml:space="preserve">, just before the questions slide</w:t>
+            </w:r>
+          </w:p>
+        </w:tc>
+        <w:tc>
+          <w:tcPr/>
+          <w:p>
+            <w:pPr>
+              <w:pStyle w:val="Compact"/>
+              <w:jc w:val="left"/>
+            </w:pPr>
+            <w:r>
+              <w:t xml:space="preserve">Pair/individual hands-on + AI</w:t>
+            </w:r>
+          </w:p>
+        </w:tc>
+        <w:tc>
+          <w:tcPr/>
+          <w:p>
+            <w:pPr>
+              <w:pStyle w:val="Compact"/>
+              <w:jc w:val="left"/>
+            </w:pPr>
+            <w:r>
+              <w:t xml:space="preserve">A device with AI access per pair; none printed</w:t>
+            </w:r>
+          </w:p>
+        </w:tc>
+        <w:tc>
+          <w:tcPr/>
+          <w:p>
+            <w:pPr>
+              <w:pStyle w:val="Compact"/>
+              <w:jc w:val="left"/>
+            </w:pPr>
+            <w:r>
+              <w:t xml:space="preserve">Participants ask an AI:</w:t>
+            </w:r>
+            <w:r>
+              <w:t xml:space="preserve"> </w:t>
+            </w:r>
+            <w:r>
+              <w:t xml:space="preserve">“I am a commissioner about to hear an evaluator present a DiD result. What are the key questions I should ask? Fit them on one slide.”</w:t>
+            </w:r>
+            <w:r>
+              <w:t xml:space="preserve"> </w:t>
+            </w:r>
+            <w:r>
+              <w:t xml:space="preserve">Three minutes, then the trainer reveals the session’s own question list and the room compares: what did the AI miss, add, or get wrong? Optional: if time is short the trainer skips straight to the list.</w:t>
+            </w:r>
+          </w:p>
+        </w:tc>
+        <w:tc>
+          <w:tcPr/>
+          <w:p>
+            <w:pPr>
+              <w:pStyle w:val="Compact"/>
+              <w:jc w:val="left"/>
+            </w:pPr>
+            <w:r>
+              <w:t xml:space="preserve">In slides (no build)</w:t>
             </w:r>
           </w:p>
         </w:tc>
@@ -3113,88 +3240,74 @@
               <w:jc w:val="left"/>
             </w:pPr>
             <w:r>
-              <w:t xml:space="preserve">Ask AI first: questions for the evaluator (OPTIONAL)</w:t>
-            </w:r>
-          </w:p>
-        </w:tc>
-        <w:tc>
-          <w:tcPr/>
-          <w:p>
-            <w:pPr>
-              <w:pStyle w:val="Compact"/>
-              <w:jc w:val="left"/>
-            </w:pPr>
-            <w:r>
-              <w:t xml:space="preserve">~1:25 · Close,</w:t>
-            </w:r>
-            <w:r>
-              <w:t xml:space="preserve"> </w:t>
-            </w:r>
-            <w:r>
-              <w:t xml:space="preserve">“Your turn: ask AI first”</w:t>
-            </w:r>
-            <w:r>
-              <w:t xml:space="preserve">, just before the questions slide</w:t>
-            </w:r>
-          </w:p>
-        </w:tc>
-        <w:tc>
-          <w:tcPr/>
-          <w:p>
-            <w:pPr>
-              <w:pStyle w:val="Compact"/>
-              <w:jc w:val="left"/>
-            </w:pPr>
-            <w:r>
-              <w:t xml:space="preserve">Pair/individual hands-on + AI</w:t>
-            </w:r>
-          </w:p>
-        </w:tc>
-        <w:tc>
-          <w:tcPr/>
-          <w:p>
-            <w:pPr>
-              <w:pStyle w:val="Compact"/>
-              <w:jc w:val="left"/>
-            </w:pPr>
-            <w:r>
-              <w:t xml:space="preserve">A device with AI access per pair; none printed</w:t>
-            </w:r>
-          </w:p>
-        </w:tc>
-        <w:tc>
-          <w:tcPr/>
-          <w:p>
-            <w:pPr>
-              <w:pStyle w:val="Compact"/>
-              <w:jc w:val="left"/>
-            </w:pPr>
-            <w:r>
-              <w:t xml:space="preserve">Participants ask an AI:</w:t>
-            </w:r>
-            <w:r>
-              <w:t xml:space="preserve"> </w:t>
-            </w:r>
-            <w:r>
-              <w:t xml:space="preserve">“I am a commissioner about to hear an evaluator present a DiD result. What are the key questions I should ask? Fit them on one slide.”</w:t>
-            </w:r>
-            <w:r>
-              <w:t xml:space="preserve"> </w:t>
-            </w:r>
-            <w:r>
-              <w:t xml:space="preserve">Three minutes, then the trainer reveals the session’s own question list and the room compares: what did the AI miss, add, or get wrong? Optional: if time is short the trainer skips straight to the list.</w:t>
-            </w:r>
-          </w:p>
-        </w:tc>
-        <w:tc>
-          <w:tcPr/>
-          <w:p>
-            <w:pPr>
-              <w:pStyle w:val="Compact"/>
-              <w:jc w:val="left"/>
-            </w:pPr>
-            <w:r>
-              <w:t xml:space="preserve">In slides (no build)</w:t>
+              <w:t>Take-away card: three questions for DiD</w:t>
+            </w:r>
+          </w:p>
+        </w:tc>
+        <w:tc>
+          <w:tcPr/>
+          <w:p>
+            <w:pPr>
+              <w:pStyle w:val="Compact"/>
+              <w:jc w:val="left"/>
+            </w:pPr>
+            <w:r>
+              <w:t>~1:28 · Close, “Three questions to ask any evaluator presenting DiD”</w:t>
+            </w:r>
+            <w:r/>
+            <w:r/>
+            <w:r/>
+          </w:p>
+        </w:tc>
+        <w:tc>
+          <w:tcPr/>
+          <w:p>
+            <w:pPr>
+              <w:pStyle w:val="Compact"/>
+              <w:jc w:val="left"/>
+            </w:pPr>
+            <w:r>
+              <w:t>Handout (take-away)</w:t>
+            </w:r>
+          </w:p>
+        </w:tc>
+        <w:tc>
+          <w:tcPr/>
+          <w:p>
+            <w:pPr>
+              <w:pStyle w:val="Compact"/>
+              <w:jc w:val="left"/>
+            </w:pPr>
+            <w:r>
+              <w:t>Take-away card (pack page 4), 1 per participant, cut</w:t>
+            </w:r>
+          </w:p>
+        </w:tc>
+        <w:tc>
+          <w:tcPr/>
+          <w:p>
+            <w:pPr>
+              <w:pStyle w:val="Compact"/>
+              <w:jc w:val="left"/>
+            </w:pPr>
+            <w:r>
+              <w:t>The closing slide’s three questions, six cards per page. Print only.</w:t>
+            </w:r>
+            <w:r/>
+            <w:r/>
+            <w:r/>
+            <w:r/>
+          </w:p>
+        </w:tc>
+        <w:tc>
+          <w:tcPr/>
+          <w:p>
+            <w:pPr>
+              <w:pStyle w:val="Compact"/>
+              <w:jc w:val="left"/>
+            </w:pPr>
+            <w:r>
+              <w:t>Built: print</w:t>
             </w:r>
           </w:p>
         </w:tc>
@@ -3214,7 +3327,7 @@
         <w:pStyle w:val="Heading2"/>
       </w:pPr>
       <w:r>
-        <w:t xml:space="preserve">Oct 13, Session 2 — Reading RDD Results</w:t>
+        <w:t>Oct 13, Session 2: Reading RDD Results</w:t>
       </w:r>
     </w:p>
     <w:p>
@@ -3949,7 +4062,83 @@
         <w:pStyle w:val="Heading2"/>
       </w:pPr>
       <w:r>
-        <w:t xml:space="preserve">Oct 13, Session 3 — Reading Matching Results (Two Case Studies)</w:t>
+        <w:t>Oct 13, Session 3: Reading Matching Results (Two Case Studies)</w:t>
+      </w:r>
+    </w:p>
+    <w:p>
+      <w:pPr>
+        <w:pStyle w:val="FirstParagraph"/>
+      </w:pPr>
+      <w:r>
+        <w:rPr>
+          <w:i/>
+          <w:iCs/>
+        </w:rPr>
+        <w:t>Revised 25 Sep: the traffic-camera case replaces the dropped Abu Dhabi DCD case as Case 2. Print materials are in Oct13_session3_materials.docx, generated by make_session_materials.R from the same data as the deck; each item opens with a print line (copies, cut or not) and the last page is the facilitator key. Participant copies, without the key, are on the course website.</w:t>
+      </w:r>
+      <w:r>
+        <w:rPr>
+          <w:rStyle w:val="VerbatimChar"/>
+          <w:i/>
+          <w:iCs/>
+        </w:rPr>
+      </w:r>
+      <w:r>
+        <w:rPr>
+          <w:i/>
+          <w:iCs/>
+        </w:rPr>
+      </w:r>
+      <w:r>
+        <w:rPr>
+          <w:i/>
+          <w:iCs/>
+        </w:rPr>
+      </w:r>
+      <w:r>
+        <w:rPr>
+          <w:rStyle w:val="VerbatimChar"/>
+          <w:i/>
+          <w:iCs/>
+        </w:rPr>
+      </w:r>
+      <w:r>
+        <w:rPr>
+          <w:i/>
+          <w:iCs/>
+        </w:rPr>
+      </w:r>
+      <w:r>
+        <w:rPr>
+          <w:i/>
+          <w:iCs/>
+        </w:rPr>
+      </w:r>
+      <w:r>
+        <w:rPr>
+          <w:rStyle w:val="VerbatimChar"/>
+          <w:i/>
+          <w:iCs/>
+        </w:rPr>
+      </w:r>
+      <w:r>
+        <w:rPr>
+          <w:i/>
+          <w:iCs/>
+        </w:rPr>
+      </w:r>
+      <w:r>
+        <w:rPr>
+          <w:i/>
+          <w:iCs/>
+        </w:rPr>
+      </w:r>
+      <w:r/>
+      <w:r>
+        <w:rPr>
+          <w:i/>
+          <w:iCs/>
+        </w:rPr>
       </w:r>
     </w:p>
     <w:tbl>
@@ -4053,7 +4242,7 @@
               <w:jc w:val="left"/>
             </w:pPr>
             <w:r>
-              <w:t xml:space="preserve">Opening poll —</w:t>
+              <w:t>Opening poll:</w:t>
             </w:r>
             <w:r>
               <w:t xml:space="preserve"> </w:t>
@@ -4159,28 +4348,26 @@
             <w:r>
               <w:t xml:space="preserve">“Find the twins”</w:t>
             </w:r>
+            <w:r/>
+            <w:r>
+              <w:t>:  matching by hand</w:t>
+            </w:r>
+          </w:p>
+        </w:tc>
+        <w:tc>
+          <w:tcPr/>
+          <w:p>
+            <w:pPr>
+              <w:pStyle w:val="Compact"/>
+              <w:jc w:val="left"/>
+            </w:pPr>
+            <w:r>
+              <w:t xml:space="preserve">~0:18 · Section 2,</w:t>
+            </w:r>
             <w:r>
               <w:t xml:space="preserve"> </w:t>
             </w:r>
             <w:r>
-              <w:t xml:space="preserve">— matching by hand</w:t>
-            </w:r>
-          </w:p>
-        </w:tc>
-        <w:tc>
-          <w:tcPr/>
-          <w:p>
-            <w:pPr>
-              <w:pStyle w:val="Compact"/>
-              <w:jc w:val="left"/>
-            </w:pPr>
-            <w:r>
-              <w:t xml:space="preserve">~0:18 · Section 2,</w:t>
-            </w:r>
-            <w:r>
-              <w:t xml:space="preserve"> </w:t>
-            </w:r>
-            <w:r>
               <w:t xml:space="preserve">“Your turn: find the twins”</w:t>
             </w:r>
           </w:p>
@@ -4205,40 +4392,34 @@
               <w:jc w:val="left"/>
             </w:pPr>
             <w:r>
-              <w:t xml:space="preserve">Printed</w:t>
-            </w:r>
-            <w:r>
-              <w:t xml:space="preserve"> </w:t>
-            </w:r>
-            <w:r>
-              <w:t xml:space="preserve">“twins card”</w:t>
-            </w:r>
-            <w:r>
-              <w:t xml:space="preserve">, one per participant</w:t>
-            </w:r>
-          </w:p>
-        </w:tc>
-        <w:tc>
-          <w:tcPr/>
-          <w:p>
-            <w:pPr>
-              <w:pStyle w:val="Compact"/>
-              <w:jc w:val="left"/>
-            </w:pPr>
-            <w:r>
-              <w:t xml:space="preserve">Participants match each of 3 enrolled businesses to the most similar not-enrolled candidate (on characteristics, not cost), then read off the cost gap between the pairs. PwC: design a clean one-page card (3 enrolled rows, 3 candidates) with space to draw pairings and note the gap. The point they should feel: matching discards candidates with no good twin.</w:t>
-            </w:r>
-          </w:p>
-        </w:tc>
-        <w:tc>
-          <w:tcPr/>
-          <w:p>
-            <w:pPr>
-              <w:pStyle w:val="Compact"/>
-              <w:jc w:val="left"/>
-            </w:pPr>
-            <w:r>
-              <w:t xml:space="preserve">Handout to build</w:t>
+              <w:t>Twins card (pack page 1), 1 per participant</w:t>
+            </w:r>
+            <w:r/>
+            <w:r/>
+            <w:r/>
+          </w:p>
+        </w:tc>
+        <w:tc>
+          <w:tcPr/>
+          <w:p>
+            <w:pPr>
+              <w:pStyle w:val="Compact"/>
+              <w:jc w:val="left"/>
+            </w:pPr>
+            <w:r>
+              <w:t>Participants pair each of 3 enrolled businesses with the most similar of 4 not-enrolled businesses (on manager age and size, not cost), then average the cost gap across the pairs. One candidate is nobody’s twin. The seven businesses are invented and marked as such. Print only.</w:t>
+            </w:r>
+          </w:p>
+        </w:tc>
+        <w:tc>
+          <w:tcPr/>
+          <w:p>
+            <w:pPr>
+              <w:pStyle w:val="Compact"/>
+              <w:jc w:val="left"/>
+            </w:pPr>
+            <w:r>
+              <w:t>Built: print</w:t>
             </w:r>
           </w:p>
         </w:tc>
@@ -4252,7 +4433,7 @@
               <w:jc w:val="left"/>
             </w:pPr>
             <w:r>
-              <w:t xml:space="preserve">AI Snapshot — main group exercise</w:t>
+              <w:t>AI Snapshot: main group exercise</w:t>
             </w:r>
           </w:p>
         </w:tc>
@@ -4288,31 +4469,31 @@
               <w:jc w:val="left"/>
             </w:pPr>
             <w:r>
-              <w:t xml:space="preserve">Printed flawed AI answer (one per pair); two prompt cards (Prompt A short, Prompt B full); the matching table on the handout; a working AI tool per table</w:t>
-            </w:r>
-          </w:p>
-        </w:tc>
-        <w:tc>
-          <w:tcPr/>
-          <w:p>
-            <w:pPr>
-              <w:pStyle w:val="Compact"/>
-              <w:jc w:val="left"/>
-            </w:pPr>
-            <w:r>
-              <w:t xml:space="preserve">Three parts: (1) mark up the flawed AI answer and find the four planted errors (balance treated as proof of no bias; a fabricated robustness-to-unobservables check; the 1,000 AED rule ignored; an invented p-value); (2) run the short vs the full prompt on the same table and compare; (3) paste the second answer into a fresh chat and ask it to review. PwC: produce the printed flawed-answer handout plus a facilitator key, the two prompt cards, and a short debrief worksheet. Swap in Fiona’s real capture when available.</w:t>
-            </w:r>
-          </w:p>
-        </w:tc>
-        <w:tc>
-          <w:tcPr/>
-          <w:p>
-            <w:pPr>
-              <w:pStyle w:val="Compact"/>
-              <w:jc w:val="left"/>
-            </w:pPr>
-            <w:r>
-              <w:t xml:space="preserve">Handouts to build (deck refers to them)</w:t>
+              <w:t>AI handout (pack page 3), 1 per group; a working AI tool per table</w:t>
+            </w:r>
+          </w:p>
+        </w:tc>
+        <w:tc>
+          <w:tcPr/>
+          <w:p>
+            <w:pPr>
+              <w:pStyle w:val="Compact"/>
+              <w:jc w:val="left"/>
+            </w:pPr>
+            <w:r>
+              <w:t>(1) Mark up the flawed AI summary of the two studies: Case 1 is reported accurately; the Case 2 claims “similarly strong, every segment matched”, “comfortably exceeding the 2.0 threshold” and “so this programme should be scaled” are false assurances. (2) Run the better prompt from the handout, compare, then paste the second answer into a fresh chat and ask it to check for overstatement. Print only.</w:t>
+            </w:r>
+          </w:p>
+        </w:tc>
+        <w:tc>
+          <w:tcPr/>
+          <w:p>
+            <w:pPr>
+              <w:pStyle w:val="Compact"/>
+              <w:jc w:val="left"/>
+            </w:pPr>
+            <w:r>
+              <w:t>Built: print</w:t>
             </w:r>
           </w:p>
         </w:tc>
@@ -4326,32 +4507,24 @@
               <w:jc w:val="left"/>
             </w:pPr>
             <w:r>
-              <w:t xml:space="preserve">Two case studies —</w:t>
-            </w:r>
-            <w:r>
-              <w:t xml:space="preserve"> </w:t>
-            </w:r>
-            <w:r>
-              <w:t xml:space="preserve">“which do you believe?”</w:t>
-            </w:r>
-          </w:p>
-        </w:tc>
-        <w:tc>
-          <w:tcPr/>
-          <w:p>
-            <w:pPr>
-              <w:pStyle w:val="Compact"/>
-              <w:jc w:val="left"/>
-            </w:pPr>
-            <w:r>
-              <w:t xml:space="preserve">~1:20–1:30 · Section 7,</w:t>
-            </w:r>
-            <w:r>
-              <w:t xml:space="preserve"> </w:t>
-            </w:r>
-            <w:r>
-              <w:t xml:space="preserve">“Which one do you believe?”</w:t>
-            </w:r>
+              <w:t>Two case studies: which would you trust?</w:t>
+            </w:r>
+            <w:r/>
+            <w:r/>
+          </w:p>
+        </w:tc>
+        <w:tc>
+          <w:tcPr/>
+          <w:p>
+            <w:pPr>
+              <w:pStyle w:val="Compact"/>
+              <w:jc w:val="left"/>
+            </w:pPr>
+            <w:r>
+              <w:t>~1:20–1:30 · Section 5, “Which case would you trust?”</w:t>
+            </w:r>
+            <w:r/>
+            <w:r/>
           </w:p>
         </w:tc>
         <w:tc>
@@ -4374,31 +4547,31 @@
               <w:jc w:val="left"/>
             </w:pPr>
             <w:r>
-              <w:t xml:space="preserve">Case 1 (GreenWaste) summary; Case 2 (imperfect-match case) handout — pending real DCD findings</w:t>
-            </w:r>
-          </w:p>
-        </w:tc>
-        <w:tc>
-          <w:tcPr/>
-          <w:p>
-            <w:pPr>
-              <w:pStyle w:val="Compact"/>
-              <w:jc w:val="left"/>
-            </w:pPr>
-            <w:r>
-              <w:t xml:space="preserve">Groups compare a clean matching study (Case 1) with a messy one where many treated units had no good match (Case 2): which gives more confidence and why, what they would ask Case 2’s evaluator that Case 1 does not raise, then a verdict round (act / act with caveats / send back). PwC: build two one-page case summaries (overlap picture, share of treated units matched, the estimate and its uncertainty) for side-by-side reading, plus verdict cards. Build Case 2 once the data arrives.</w:t>
-            </w:r>
-          </w:p>
-        </w:tc>
-        <w:tc>
-          <w:tcPr/>
-          <w:p>
-            <w:pPr>
-              <w:pStyle w:val="Compact"/>
-              <w:jc w:val="left"/>
-            </w:pPr>
-            <w:r>
-              <w:t xml:space="preserve">PLACEHOLDER — awaiting DCD data</w:t>
+              <w:t>Two-case sheet (pack page 2), 1 per group</w:t>
+            </w:r>
+          </w:p>
+        </w:tc>
+        <w:tc>
+          <w:tcPr/>
+          <w:p>
+            <w:pPr>
+              <w:pStyle w:val="Compact"/>
+              <w:jc w:val="left"/>
+            </w:pPr>
+            <w:r>
+              <w:t>Groups compare GreenWaste (Case 1) with the traffic cameras (Case 2) on the side-by-side table from the deck, answer the slide’s three questions, and give a verdict on each case (act / act with conditions / send back). Print only.</w:t>
+            </w:r>
+          </w:p>
+        </w:tc>
+        <w:tc>
+          <w:tcPr/>
+          <w:p>
+            <w:pPr>
+              <w:pStyle w:val="Compact"/>
+              <w:jc w:val="left"/>
+            </w:pPr>
+            <w:r>
+              <w:t>Built: print</w:t>
             </w:r>
           </w:p>
         </w:tc>
@@ -4412,31 +4585,23 @@
               <w:jc w:val="left"/>
             </w:pPr>
             <w:r>
-              <w:t xml:space="preserve">Closing</w:t>
-            </w:r>
-            <w:r>
-              <w:t xml:space="preserve"> </w:t>
-            </w:r>
-            <w:r>
-              <w:t xml:space="preserve">“three questions”</w:t>
-            </w:r>
-            <w:r>
-              <w:t xml:space="preserve"> </w:t>
-            </w:r>
-            <w:r>
-              <w:t xml:space="preserve">take-away card</w:t>
-            </w:r>
-          </w:p>
-        </w:tc>
-        <w:tc>
-          <w:tcPr/>
-          <w:p>
-            <w:pPr>
-              <w:pStyle w:val="Compact"/>
-              <w:jc w:val="left"/>
-            </w:pPr>
-            <w:r>
-              <w:t xml:space="preserve">~1:32 · Section 8, closing slide</w:t>
+              <w:t>Take-away card: five questions for matching</w:t>
+            </w:r>
+            <w:r/>
+            <w:r/>
+            <w:r/>
+            <w:r/>
+          </w:p>
+        </w:tc>
+        <w:tc>
+          <w:tcPr/>
+          <w:p>
+            <w:pPr>
+              <w:pStyle w:val="Compact"/>
+              <w:jc w:val="left"/>
+            </w:pPr>
+            <w:r>
+              <w:t>~1:52 · Close, “Five questions to ask any evaluator presenting matching”</w:t>
             </w:r>
           </w:p>
         </w:tc>
@@ -4460,31 +4625,31 @@
               <w:jc w:val="left"/>
             </w:pPr>
             <w:r>
-              <w:t xml:space="preserve">Printed pocket card, one per participant</w:t>
-            </w:r>
-          </w:p>
-        </w:tc>
-        <w:tc>
-          <w:tcPr/>
-          <w:p>
-            <w:pPr>
-              <w:pStyle w:val="Compact"/>
-              <w:jc w:val="left"/>
-            </w:pPr>
-            <w:r>
-              <w:t xml:space="preserve">A take-away card with the three questions to ask any evaluator presenting matching: what did you match on and what could you not measure? how many treated units had a good match, and who got dropped? does it clear our bar, and does the answer hold if you change what you matched on? Optional.</w:t>
-            </w:r>
-          </w:p>
-        </w:tc>
-        <w:tc>
-          <w:tcPr/>
-          <w:p>
-            <w:pPr>
-              <w:pStyle w:val="Compact"/>
-              <w:jc w:val="left"/>
-            </w:pPr>
-            <w:r>
-              <w:t xml:space="preserve">Handout (optional)</w:t>
+              <w:t>Take-away card (pack page 4), 1 per participant, cut</w:t>
+            </w:r>
+          </w:p>
+        </w:tc>
+        <w:tc>
+          <w:tcPr/>
+          <w:p>
+            <w:pPr>
+              <w:pStyle w:val="Compact"/>
+              <w:jc w:val="left"/>
+            </w:pPr>
+            <w:r>
+              <w:t>The closing slide’s five questions, six cards per page. Print only.</w:t>
+            </w:r>
+          </w:p>
+        </w:tc>
+        <w:tc>
+          <w:tcPr/>
+          <w:p>
+            <w:pPr>
+              <w:pStyle w:val="Compact"/>
+              <w:jc w:val="left"/>
+            </w:pPr>
+            <w:r>
+              <w:t>Built: print</w:t>
             </w:r>
           </w:p>
         </w:tc>
@@ -4599,7 +4764,7 @@
         <w:pStyle w:val="Heading2"/>
       </w:pPr>
       <w:r>
-        <w:t xml:space="preserve">Oct 14, Session 1 — Was It Worth It? (Cost Analysis)</w:t>
+        <w:t>Oct 14, Session 1: Was It Worth It? (Cost Analysis)</w:t>
       </w:r>
     </w:p>
     <w:p>
@@ -5285,7 +5450,7 @@
         <w:pStyle w:val="Heading2"/>
       </w:pPr>
       <w:r>
-        <w:t xml:space="preserve">Oct 14, Session 2 — What Can You Read? What Might Be Wrong? (Data Visualisation)</w:t>
+        <w:t>Oct 14, Session 2: What Can You Read? What Might Be Wrong? (Data Visualisation)</w:t>
       </w:r>
     </w:p>
     <w:p>
@@ -5297,7 +5462,7 @@
           <w:i/>
           <w:iCs/>
         </w:rPr>
-        <w:t xml:space="preserve">Now drafted. Discussion-heavy; no live Menti poll in this session. Built on figures drawn from the three datasets the week has already used.</w:t>
+        <w:t>Discussion-heavy; no live Menti poll in this session. Built on figures drawn from the three datasets the week has already used, and three “Try it” slides run R live. Print materials are in Oct14_session2_materials.docx, generated by make_session_materials.R from the same data as the deck; each item opens with a print line (copies, cut or not) and the last page is the facilitator key. Participant copies, without the key, are on the course website.</w:t>
       </w:r>
     </w:p>
     <w:tbl>
@@ -5493,79 +5658,73 @@
               <w:jc w:val="left"/>
             </w:pPr>
             <w:r>
-              <w:t xml:space="preserve">Pie chart —</w:t>
-            </w:r>
-            <w:r>
-              <w:t xml:space="preserve"> </w:t>
-            </w:r>
-            <w:r>
-              <w:t xml:space="preserve">“what is it not telling you?”</w:t>
-            </w:r>
-          </w:p>
-        </w:tc>
-        <w:tc>
-          <w:tcPr/>
-          <w:p>
-            <w:pPr>
-              <w:pStyle w:val="Compact"/>
-              <w:jc w:val="left"/>
-            </w:pPr>
-            <w:r>
-              <w:t xml:space="preserve">~0:44 · Section 6,</w:t>
-            </w:r>
-            <w:r>
-              <w:t xml:space="preserve"> </w:t>
-            </w:r>
-            <w:r>
-              <w:t xml:space="preserve">“What is this pie not telling you?”</w:t>
-            </w:r>
-          </w:p>
-        </w:tc>
-        <w:tc>
-          <w:tcPr/>
-          <w:p>
-            <w:pPr>
-              <w:pStyle w:val="Compact"/>
-              <w:jc w:val="left"/>
-            </w:pPr>
-            <w:r>
-              <w:t xml:space="preserve">Think-pair-share (no tech)</w:t>
-            </w:r>
-          </w:p>
-        </w:tc>
-        <w:tc>
-          <w:tcPr/>
-          <w:p>
-            <w:pPr>
-              <w:pStyle w:val="Compact"/>
-              <w:jc w:val="left"/>
-            </w:pPr>
-            <w:r>
-              <w:t xml:space="preserve">None (optional flipchart / worksheet)</w:t>
-            </w:r>
-          </w:p>
-        </w:tc>
-        <w:tc>
-          <w:tcPr/>
-          <w:p>
-            <w:pPr>
-              <w:pStyle w:val="Compact"/>
-              <w:jc w:val="left"/>
-            </w:pPr>
-            <w:r>
-              <w:t xml:space="preserve">A real severity-mix pie from the dataset. In groups, three minutes: write what the pie cannot show (no denominator, no change over time, no comparison). Optional: a half-page worksheet with the pie and space to write.</w:t>
-            </w:r>
-          </w:p>
-        </w:tc>
-        <w:tc>
-          <w:tcPr/>
-          <w:p>
-            <w:pPr>
-              <w:pStyle w:val="Compact"/>
-              <w:jc w:val="left"/>
-            </w:pPr>
-            <w:r>
-              <w:t xml:space="preserve">In slides (optional worksheet)</w:t>
+              <w:t>Six pairs tracker</w:t>
+            </w:r>
+          </w:p>
+        </w:tc>
+        <w:tc>
+          <w:tcPr/>
+          <w:p>
+            <w:pPr>
+              <w:pStyle w:val="Compact"/>
+              <w:jc w:val="left"/>
+            </w:pPr>
+            <w:r>
+              <w:t>Throughout</w:t>
+            </w:r>
+            <w:r/>
+            <w:r/>
+          </w:p>
+        </w:tc>
+        <w:tc>
+          <w:tcPr/>
+          <w:p>
+            <w:pPr>
+              <w:pStyle w:val="Compact"/>
+              <w:jc w:val="left"/>
+            </w:pPr>
+            <w:r>
+              <w:t>Individual record sheet</w:t>
+            </w:r>
+          </w:p>
+        </w:tc>
+        <w:tc>
+          <w:tcPr/>
+          <w:p>
+            <w:pPr>
+              <w:pStyle w:val="Compact"/>
+              <w:jc w:val="left"/>
+            </w:pPr>
+            <w:r>
+              <w:t>Tracker (pack page 1), 1 per participant</w:t>
+            </w:r>
+          </w:p>
+        </w:tc>
+        <w:tc>
+          <w:tcPr/>
+          <w:p>
+            <w:pPr>
+              <w:pStyle w:val="Compact"/>
+              <w:jc w:val="left"/>
+            </w:pPr>
+            <w:r>
+              <w:t>One row per pair of figures, with the slide’s two questions (what is it telling you, what might be wrong or misleading), and three predictions to write down before the reveals. Print only.</w:t>
+            </w:r>
+            <w:r/>
+            <w:r/>
+            <w:r/>
+            <w:r/>
+          </w:p>
+        </w:tc>
+        <w:tc>
+          <w:tcPr/>
+          <w:p>
+            <w:pPr>
+              <w:pStyle w:val="Compact"/>
+              <w:jc w:val="left"/>
+            </w:pPr>
+            <w:r>
+              <w:t>Built: print</w:t>
             </w:r>
           </w:p>
         </w:tc>
@@ -5579,12 +5738,98 @@
               <w:jc w:val="left"/>
             </w:pPr>
             <w:r>
-              <w:t xml:space="preserve">AI Snapshot —</w:t>
+              <w:t>Pie chart:</w:t>
             </w:r>
             <w:r>
               <w:t xml:space="preserve"> </w:t>
             </w:r>
             <w:r>
+              <w:t xml:space="preserve">“what is it not telling you?”</w:t>
+            </w:r>
+          </w:p>
+        </w:tc>
+        <w:tc>
+          <w:tcPr/>
+          <w:p>
+            <w:pPr>
+              <w:pStyle w:val="Compact"/>
+              <w:jc w:val="left"/>
+            </w:pPr>
+            <w:r>
+              <w:t xml:space="preserve">~0:44 · Section 6,</w:t>
+            </w:r>
+            <w:r>
+              <w:t xml:space="preserve"> </w:t>
+            </w:r>
+            <w:r>
+              <w:t xml:space="preserve">“What is this pie not telling you?”</w:t>
+            </w:r>
+          </w:p>
+        </w:tc>
+        <w:tc>
+          <w:tcPr/>
+          <w:p>
+            <w:pPr>
+              <w:pStyle w:val="Compact"/>
+              <w:jc w:val="left"/>
+            </w:pPr>
+            <w:r>
+              <w:t xml:space="preserve">Think-pair-share (no tech)</w:t>
+            </w:r>
+          </w:p>
+        </w:tc>
+        <w:tc>
+          <w:tcPr/>
+          <w:p>
+            <w:pPr>
+              <w:pStyle w:val="Compact"/>
+              <w:jc w:val="left"/>
+            </w:pPr>
+            <w:r>
+              <w:t>The pie row on the six pairs tracker</w:t>
+            </w:r>
+          </w:p>
+        </w:tc>
+        <w:tc>
+          <w:tcPr/>
+          <w:p>
+            <w:pPr>
+              <w:pStyle w:val="Compact"/>
+              <w:jc w:val="left"/>
+            </w:pPr>
+            <w:r>
+              <w:t>A real severity-mix pie from the dataset. In groups, three minutes: two things the pie tells you and two it does not. Answers go in the pie row of the tracker.</w:t>
+            </w:r>
+          </w:p>
+        </w:tc>
+        <w:tc>
+          <w:tcPr/>
+          <w:p>
+            <w:pPr>
+              <w:pStyle w:val="Compact"/>
+              <w:jc w:val="left"/>
+            </w:pPr>
+            <w:r>
+              <w:t>In slides; on the tracker</w:t>
+            </w:r>
+          </w:p>
+        </w:tc>
+      </w:tr>
+      <w:tr>
+        <w:tc>
+          <w:tcPr/>
+          <w:p>
+            <w:pPr>
+              <w:pStyle w:val="Compact"/>
+              <w:jc w:val="left"/>
+            </w:pPr>
+            <w:r>
+              <w:t>AI Snapshot:</w:t>
+            </w:r>
+            <w:r>
+              <w:t xml:space="preserve"> </w:t>
+            </w:r>
+            <w:r>
               <w:t xml:space="preserve">“the chart that cannot be wrong”</w:t>
             </w:r>
           </w:p>
@@ -5627,55 +5872,42 @@
               <w:jc w:val="left"/>
             </w:pPr>
             <w:r>
-              <w:t xml:space="preserve">The two GreenWaste baseline figures (zero-axis and truncated) on a handout; two prompt cards; a device with AI access per group</w:t>
-            </w:r>
-          </w:p>
-        </w:tc>
-        <w:tc>
-          <w:tcPr/>
-          <w:p>
-            <w:pPr>
-              <w:pStyle w:val="Compact"/>
-              <w:jc w:val="left"/>
-            </w:pPr>
-            <w:r>
-              <w:t xml:space="preserve">Groups give the model both baseline figures with the prompt</w:t>
-            </w:r>
-            <w:r>
-              <w:t xml:space="preserve"> </w:t>
-            </w:r>
-            <w:r>
-              <w:t xml:space="preserve">“Which chart better shows the difference between the two groups, and why?”</w:t>
-            </w:r>
-            <w:r>
-              <w:t xml:space="preserve"> </w:t>
-            </w:r>
-            <w:r>
-              <w:t xml:space="preserve">and mark up the</w:t>
-            </w:r>
-            <w:r>
-              <w:t xml:space="preserve"> </w:t>
-            </w:r>
+              <w:t>AI handout with both baseline figures (pack page 2), 1 per group; a device with AI access per group</w:t>
+            </w:r>
+          </w:p>
+        </w:tc>
+        <w:tc>
+          <w:tcPr/>
+          <w:p>
+            <w:pPr>
+              <w:pStyle w:val="Compact"/>
+              <w:jc w:val="left"/>
+            </w:pPr>
+            <w:r>
+              <w:t>Groups give the model both baseline figures with the prompt “Which of these two charts better represents the difference between the two groups, and why?” and judge the answer. The planted failure: true statements about the charts, and no question about who reads the figure or what sentence sits beside it. Then the better prompt from the handout, and a fresh-chat check. Print only.</w:t>
+            </w:r>
+            <w:r/>
+            <w:r/>
+            <w:r/>
+            <w:r/>
+            <w:r/>
             <w:r>
               <w:rPr>
                 <w:rStyle w:val="VerbatimChar"/>
               </w:rPr>
-              <w:t xml:space="preserve">.ai-output</w:t>
-            </w:r>
-            <w:r>
-              <w:t xml:space="preserve">. The planted failure: the AI makes true statements about the charts but never asks the question that matters (which is honest for the reader). Then a better prompt that names the reader and the sentence the chart must support. PwC: print the two figures and the two prompt cards.</w:t>
-            </w:r>
-          </w:p>
-        </w:tc>
-        <w:tc>
-          <w:tcPr/>
-          <w:p>
-            <w:pPr>
-              <w:pStyle w:val="Compact"/>
-              <w:jc w:val="left"/>
-            </w:pPr>
-            <w:r>
-              <w:t xml:space="preserve">Handout + cards to build</w:t>
+            </w:r>
+            <w:r/>
+          </w:p>
+        </w:tc>
+        <w:tc>
+          <w:tcPr/>
+          <w:p>
+            <w:pPr>
+              <w:pStyle w:val="Compact"/>
+              <w:jc w:val="left"/>
+            </w:pPr>
+            <w:r>
+              <w:t>Built: print</w:t>
             </w:r>
           </w:p>
         </w:tc>
@@ -5689,7 +5921,7 @@
               <w:jc w:val="left"/>
             </w:pPr>
             <w:r>
-              <w:t xml:space="preserve">Closing — start compiling QA-clinic questions</w:t>
+              <w:t>Closing: start compiling QA-clinic questions</w:t>
             </w:r>
           </w:p>
         </w:tc>
@@ -5725,31 +5957,31 @@
               <w:jc w:val="left"/>
             </w:pPr>
             <w:r>
-              <w:t xml:space="preserve">None</w:t>
-            </w:r>
-          </w:p>
-        </w:tc>
-        <w:tc>
-          <w:tcPr/>
-          <w:p>
-            <w:pPr>
-              <w:pStyle w:val="Compact"/>
-              <w:jc w:val="left"/>
-            </w:pPr>
-            <w:r>
-              <w:t xml:space="preserve">The session closes by asking participants to start writing the questions they will bring to tomorrow’s QA clinic (Oct 14 S3). No build; flagged so the clinic’s opening can reference it.</w:t>
-            </w:r>
-          </w:p>
-        </w:tc>
-        <w:tc>
-          <w:tcPr/>
-          <w:p>
-            <w:pPr>
-              <w:pStyle w:val="Compact"/>
-              <w:jc w:val="left"/>
-            </w:pPr>
-            <w:r>
-              <w:t xml:space="preserve">In slides</w:t>
+              <w:t>Take-away card (pack page 3), 1 per participant, cut</w:t>
+            </w:r>
+          </w:p>
+        </w:tc>
+        <w:tc>
+          <w:tcPr/>
+          <w:p>
+            <w:pPr>
+              <w:pStyle w:val="Compact"/>
+              <w:jc w:val="left"/>
+            </w:pPr>
+            <w:r>
+              <w:t>The five rules as a take-away card, with space for the questions participants will bring to tomorrow’s QA clinic (Oct 14 S3). Print only.</w:t>
+            </w:r>
+          </w:p>
+        </w:tc>
+        <w:tc>
+          <w:tcPr/>
+          <w:p>
+            <w:pPr>
+              <w:pStyle w:val="Compact"/>
+              <w:jc w:val="left"/>
+            </w:pPr>
+            <w:r>
+              <w:t>Built: print</w:t>
             </w:r>
           </w:p>
         </w:tc>
@@ -5769,7 +6001,7 @@
         <w:pStyle w:val="Heading2"/>
       </w:pPr>
       <w:r>
-        <w:t xml:space="preserve">Oct 14, Session 3 —</w:t>
+        <w:t>Oct 14, Session 3:</w:t>
       </w:r>
       <w:r>
         <w:t xml:space="preserve"> </w:t>
@@ -6418,7 +6650,7 @@
         <w:pStyle w:val="Heading2"/>
       </w:pPr>
       <w:r>
-        <w:t xml:space="preserve">Oct 15, Session 1 — Is This Evidence Credible? (QA Deep Dive)</w:t>
+        <w:t>Oct 15, Session 1: Is This Evidence Credible? (QA Deep Dive)</w:t>
       </w:r>
     </w:p>
     <w:p>
@@ -6430,61 +6662,45 @@
           <w:i/>
           <w:iCs/>
         </w:rPr>
-        <w:t xml:space="preserve">Materials built and ready to print:</w:t>
-      </w:r>
-      <w:r>
-        <w:t xml:space="preserve"> </w:t>
-      </w:r>
+        <w:t>The fictitious report is Oct15_session1_report.docx, rendered from Oct15_session1_report.qmd. Print materials are in Oct15_session1_materials.docx, generated by make_session_materials.R from the same data as the deck; each item opens with a print line (copies, cut or not) and the last page is the facilitator key. Participant copies, without the key, are on the course website. The rating sheet and the reveal slides both read qa_rating.R.</w:t>
+      </w:r>
+      <w:r/>
       <w:r>
         <w:rPr>
           <w:rStyle w:val="VerbatimChar"/>
         </w:rPr>
-        <w:t xml:space="preserve">Oct15_session1_report.qmd</w:t>
-      </w:r>
-      <w:r>
-        <w:t xml:space="preserve"> </w:t>
-      </w:r>
-      <w:r>
-        <w:rPr>
-          <w:i/>
-          <w:iCs/>
-        </w:rPr>
-        <w:t xml:space="preserve">renders to docx as the fictitious report the room rates, and</w:t>
-      </w:r>
-      <w:r>
-        <w:t xml:space="preserve"> </w:t>
-      </w:r>
+      </w:r>
+      <w:r/>
+      <w:r>
+        <w:rPr>
+          <w:i/>
+          <w:iCs/>
+        </w:rPr>
+      </w:r>
+      <w:r/>
       <w:r>
         <w:rPr>
           <w:rStyle w:val="VerbatimChar"/>
         </w:rPr>
-        <w:t xml:space="preserve">Oct15_session1_rating_sheet.qmd</w:t>
-      </w:r>
-      <w:r>
-        <w:t xml:space="preserve"> </w:t>
-      </w:r>
-      <w:r>
-        <w:rPr>
-          <w:i/>
-          <w:iCs/>
-        </w:rPr>
-        <w:t xml:space="preserve">renders to docx as the rating sheet. Both are generated from</w:t>
-      </w:r>
-      <w:r>
-        <w:t xml:space="preserve"> </w:t>
-      </w:r>
+      </w:r>
+      <w:r/>
+      <w:r>
+        <w:rPr>
+          <w:i/>
+          <w:iCs/>
+        </w:rPr>
+      </w:r>
+      <w:r/>
       <w:r>
         <w:rPr>
           <w:rStyle w:val="VerbatimChar"/>
         </w:rPr>
-        <w:t xml:space="preserve">qa_rating.R</w:t>
-      </w:r>
-      <w:r>
-        <w:rPr>
-          <w:i/>
-          <w:iCs/>
-        </w:rPr>
-        <w:t xml:space="preserve">, which also drives the deck’s reveal slides.</w:t>
+      </w:r>
+      <w:r>
+        <w:rPr>
+          <w:i/>
+          <w:iCs/>
+        </w:rPr>
       </w:r>
     </w:p>
     <w:tbl>
@@ -6713,31 +6929,31 @@
               <w:jc w:val="left"/>
             </w:pPr>
             <w:r>
-              <w:t xml:space="preserve">The report and the rating sheet (both built)</w:t>
-            </w:r>
-          </w:p>
-        </w:tc>
-        <w:tc>
-          <w:tcPr/>
-          <w:p>
-            <w:pPr>
-              <w:pStyle w:val="Compact"/>
-              <w:jc w:val="left"/>
-            </w:pPr>
-            <w:r>
-              <w:t xml:space="preserve">Five minutes, working individually before any group discussion: read the executive summary and rate it on the rating sheet. PwC: print the report and the rating sheet (already built).</w:t>
-            </w:r>
-          </w:p>
-        </w:tc>
-        <w:tc>
-          <w:tcPr/>
-          <w:p>
-            <w:pPr>
-              <w:pStyle w:val="Compact"/>
-              <w:jc w:val="left"/>
-            </w:pPr>
-            <w:r>
-              <w:t xml:space="preserve">Handouts built — print only</w:t>
+              <w:t>The report (Oct15_session1_report.docx) and the rating sheet (pack page 1), 1 each per participant</w:t>
+            </w:r>
+          </w:p>
+        </w:tc>
+        <w:tc>
+          <w:tcPr/>
+          <w:p>
+            <w:pPr>
+              <w:pStyle w:val="Compact"/>
+              <w:jc w:val="left"/>
+            </w:pPr>
+            <w:r>
+              <w:t>Five minutes, working individually before any group discussion: read the executive summary and rate it on the rating sheet. Print only.</w:t>
+            </w:r>
+          </w:p>
+        </w:tc>
+        <w:tc>
+          <w:tcPr/>
+          <w:p>
+            <w:pPr>
+              <w:pStyle w:val="Compact"/>
+              <w:jc w:val="left"/>
+            </w:pPr>
+            <w:r>
+              <w:t>Built: print</w:t>
             </w:r>
           </w:p>
         </w:tc>
@@ -6787,31 +7003,31 @@
               <w:jc w:val="left"/>
             </w:pPr>
             <w:r>
-              <w:t xml:space="preserve">The rating sheet (built)</w:t>
-            </w:r>
-          </w:p>
-        </w:tc>
-        <w:tc>
-          <w:tcPr/>
-          <w:p>
-            <w:pPr>
-              <w:pStyle w:val="Compact"/>
-              <w:jc w:val="left"/>
-            </w:pPr>
-            <w:r>
-              <w:t xml:space="preserve">Rate the remaining five sections (design, data, results, limitations, conclusions) on the rating sheet, one colour plus the reason that decided it; groups then defend their colours. Amber is framed as the most useful rating. PwC: rating sheet already built.</w:t>
-            </w:r>
-          </w:p>
-        </w:tc>
-        <w:tc>
-          <w:tcPr/>
-          <w:p>
-            <w:pPr>
-              <w:pStyle w:val="Compact"/>
-              <w:jc w:val="left"/>
-            </w:pPr>
-            <w:r>
-              <w:t xml:space="preserve">Handout built — print only</w:t>
+              <w:t>The rating sheet (pack page 1) and the verdict page on its back (pack page 2)</w:t>
+            </w:r>
+          </w:p>
+        </w:tc>
+        <w:tc>
+          <w:tcPr/>
+          <w:p>
+            <w:pPr>
+              <w:pStyle w:val="Compact"/>
+              <w:jc w:val="left"/>
+            </w:pPr>
+            <w:r>
+              <w:t>Rate the remaining five sections (design, data, results, limitations, conclusions) on the rating sheet, one colour plus the reason that decided it; groups then defend their colours. The verdict page records both sign-off votes, the most important problem and the strongest point. Print only.</w:t>
+            </w:r>
+          </w:p>
+        </w:tc>
+        <w:tc>
+          <w:tcPr/>
+          <w:p>
+            <w:pPr>
+              <w:pStyle w:val="Compact"/>
+              <w:jc w:val="left"/>
+            </w:pPr>
+            <w:r>
+              <w:t>Built: print</w:t>
             </w:r>
           </w:p>
         </w:tc>
@@ -6861,31 +7077,105 @@
               <w:jc w:val="left"/>
             </w:pPr>
             <w:r>
-              <w:t xml:space="preserve">A device with AI access per group</w:t>
-            </w:r>
-          </w:p>
-        </w:tc>
-        <w:tc>
-          <w:tcPr/>
-          <w:p>
-            <w:pPr>
-              <w:pStyle w:val="Compact"/>
-              <w:jc w:val="left"/>
-            </w:pPr>
-            <w:r>
-              <w:t xml:space="preserve">Each group asks an AI for a credibility verdict on the report, then compares it with the group’s own rating. No printed build; confirm an AI tool per group.</w:t>
-            </w:r>
-          </w:p>
-        </w:tc>
-        <w:tc>
-          <w:tcPr/>
-          <w:p>
-            <w:pPr>
-              <w:pStyle w:val="Compact"/>
-              <w:jc w:val="left"/>
-            </w:pPr>
-            <w:r>
-              <w:t xml:space="preserve">In slides</w:t>
+              <w:t>AI handout (pack page 3), 1 per group; a device with AI access per group</w:t>
+            </w:r>
+          </w:p>
+        </w:tc>
+        <w:tc>
+          <w:tcPr/>
+          <w:p>
+            <w:pPr>
+              <w:pStyle w:val="Compact"/>
+              <w:jc w:val="left"/>
+            </w:pPr>
+            <w:r>
+              <w:t>Each group runs the prompt on the report, compares the AI’s verdict and the handout’s example with its own rating, finds the two unsupported claims and the larger problem, then runs the better prompt. Print only.</w:t>
+            </w:r>
+          </w:p>
+        </w:tc>
+        <w:tc>
+          <w:tcPr/>
+          <w:p>
+            <w:pPr>
+              <w:pStyle w:val="Compact"/>
+              <w:jc w:val="left"/>
+            </w:pPr>
+            <w:r>
+              <w:t>Built: print</w:t>
+            </w:r>
+          </w:p>
+        </w:tc>
+      </w:tr>
+      <w:tr>
+        <w:tc>
+          <w:tcPr/>
+          <w:p>
+            <w:pPr>
+              <w:pStyle w:val="Compact"/>
+              <w:jc w:val="left"/>
+            </w:pPr>
+            <w:r>
+              <w:t>Take-away card: three habits for reading a report</w:t>
+            </w:r>
+          </w:p>
+        </w:tc>
+        <w:tc>
+          <w:tcPr/>
+          <w:p>
+            <w:pPr>
+              <w:pStyle w:val="Compact"/>
+              <w:jc w:val="left"/>
+            </w:pPr>
+            <w:r>
+              <w:t>~1:25 · Section 6, “Three habits for reading a report”</w:t>
+            </w:r>
+          </w:p>
+        </w:tc>
+        <w:tc>
+          <w:tcPr/>
+          <w:p>
+            <w:pPr>
+              <w:pStyle w:val="Compact"/>
+              <w:jc w:val="left"/>
+            </w:pPr>
+            <w:r>
+              <w:t>Handout (take-away)</w:t>
+            </w:r>
+          </w:p>
+        </w:tc>
+        <w:tc>
+          <w:tcPr/>
+          <w:p>
+            <w:pPr>
+              <w:pStyle w:val="Compact"/>
+              <w:jc w:val="left"/>
+            </w:pPr>
+            <w:r>
+              <w:t>Take-away card (pack page 4), 1 per participant, cut</w:t>
+            </w:r>
+          </w:p>
+        </w:tc>
+        <w:tc>
+          <w:tcPr/>
+          <w:p>
+            <w:pPr>
+              <w:pStyle w:val="Compact"/>
+              <w:jc w:val="left"/>
+            </w:pPr>
+            <w:r>
+              <w:t>The closing slide’s three habits, six cards per page. Print only.</w:t>
+            </w:r>
+          </w:p>
+        </w:tc>
+        <w:tc>
+          <w:tcPr/>
+          <w:p>
+            <w:pPr>
+              <w:pStyle w:val="Compact"/>
+              <w:jc w:val="left"/>
+            </w:pPr>
+            <w:r>
+              <w:t>Built: print</w:t>
             </w:r>
           </w:p>
         </w:tc>
@@ -6905,7 +7195,7 @@
         <w:pStyle w:val="Heading2"/>
       </w:pPr>
       <w:r>
-        <w:t xml:space="preserve">Oct 15, Session 2 — From Findings to Policy (Evidence Translation)</w:t>
+        <w:t>Oct 15, Session 2: From Findings to Policy (Evidence Translation)</w:t>
       </w:r>
     </w:p>
     <w:p>
@@ -7700,7 +7990,7 @@
         <w:pStyle w:val="Heading2"/>
       </w:pPr>
       <w:r>
-        <w:t xml:space="preserve">Oct 15, Session 3 — Plan Your Own Evaluation (Building on Module 1)</w:t>
+        <w:t>Oct 15, Session 3: Plan Your Own Evaluation (Building on Module 1)</w:t>
       </w:r>
     </w:p>
     <w:p>
@@ -7712,42 +8002,32 @@
           <w:i/>
           <w:iCs/>
         </w:rPr>
-        <w:t xml:space="preserve">Team working time followed by a pitch. No AI Snapshot in this session. Material built and ready to print:</w:t>
-      </w:r>
-      <w:r>
-        <w:t xml:space="preserve"> </w:t>
-      </w:r>
+        <w:t>Team working time followed by a pitch. No AI Snapshot in this session. Print materials are in Oct15_session3_materials.docx, generated by make_session_materials.R from the same data as the deck; each item opens with a print line (copies, cut or not) and the last page is the facilitator key. Participant copies, without the key, are on the course website. The Design Update template recaps Module 1’s eight conditions (from qa_design_update.R), so teams can complete it without the Module 1 document to hand.</w:t>
+      </w:r>
+      <w:r/>
       <w:r>
         <w:rPr>
           <w:rStyle w:val="VerbatimChar"/>
         </w:rPr>
-        <w:t xml:space="preserve">Oct15_session3_design_template.qmd</w:t>
-      </w:r>
-      <w:r>
-        <w:t xml:space="preserve"> </w:t>
-      </w:r>
-      <w:r>
-        <w:rPr>
-          <w:i/>
-          <w:iCs/>
-        </w:rPr>
-        <w:t xml:space="preserve">renders to docx as the Evaluation Design Update template (generated from</w:t>
-      </w:r>
-      <w:r>
-        <w:t xml:space="preserve"> </w:t>
-      </w:r>
+      </w:r>
+      <w:r/>
+      <w:r>
+        <w:rPr>
+          <w:i/>
+          <w:iCs/>
+        </w:rPr>
+      </w:r>
+      <w:r/>
       <w:r>
         <w:rPr>
           <w:rStyle w:val="VerbatimChar"/>
         </w:rPr>
-        <w:t xml:space="preserve">qa_design_update.R</w:t>
-      </w:r>
-      <w:r>
-        <w:rPr>
-          <w:i/>
-          <w:iCs/>
-        </w:rPr>
-        <w:t xml:space="preserve">); it recaps Module 1’s eight conditions so teams can complete it without the Module 1 document to hand.</w:t>
+      </w:r>
+      <w:r>
+        <w:rPr>
+          <w:i/>
+          <w:iCs/>
+        </w:rPr>
       </w:r>
     </w:p>
     <w:tbl>
@@ -7937,7 +8217,7 @@
               <w:jc w:val="left"/>
             </w:pPr>
             <w:r>
-              <w:t xml:space="preserve">Part 1 — current design against the eight conditions</w:t>
+              <w:t>Part 1: current design against the eight conditions</w:t>
             </w:r>
           </w:p>
         </w:tc>
@@ -7979,31 +8259,31 @@
               <w:jc w:val="left"/>
             </w:pPr>
             <w:r>
-              <w:t xml:space="preserve">The design template (built), one per team</w:t>
-            </w:r>
-          </w:p>
-        </w:tc>
-        <w:tc>
-          <w:tcPr/>
-          <w:p>
-            <w:pPr>
-              <w:pStyle w:val="Compact"/>
-              <w:jc w:val="left"/>
-            </w:pPr>
-            <w:r>
-              <w:t xml:space="preserve">Twenty minutes: write the current design against Module 1’s eight conditions in Part 1 of the template. PwC: template already built.</w:t>
-            </w:r>
-          </w:p>
-        </w:tc>
-        <w:tc>
-          <w:tcPr/>
-          <w:p>
-            <w:pPr>
-              <w:pStyle w:val="Compact"/>
-              <w:jc w:val="left"/>
-            </w:pPr>
-            <w:r>
-              <w:t xml:space="preserve">Handout built — print only</w:t>
+              <w:t>Design Update template (pack pages 1–3), 1 per team</w:t>
+            </w:r>
+          </w:p>
+        </w:tc>
+        <w:tc>
+          <w:tcPr/>
+          <w:p>
+            <w:pPr>
+              <w:pStyle w:val="Compact"/>
+              <w:jc w:val="left"/>
+            </w:pPr>
+            <w:r>
+              <w:t>Twenty minutes: write the current design against Module 1’s eight conditions in Part 1 of the template, plus the team’s counterfactual in one sentence. Print only.</w:t>
+            </w:r>
+          </w:p>
+        </w:tc>
+        <w:tc>
+          <w:tcPr/>
+          <w:p>
+            <w:pPr>
+              <w:pStyle w:val="Compact"/>
+              <w:jc w:val="left"/>
+            </w:pPr>
+            <w:r>
+              <w:t>Built: print</w:t>
             </w:r>
           </w:p>
         </w:tc>
@@ -8017,7 +8297,7 @@
               <w:jc w:val="left"/>
             </w:pPr>
             <w:r>
-              <w:t xml:space="preserve">Part 2 — the four additions</w:t>
+              <w:t>Part 2: the four additions</w:t>
             </w:r>
           </w:p>
         </w:tc>
@@ -8059,31 +8339,31 @@
               <w:jc w:val="left"/>
             </w:pPr>
             <w:r>
-              <w:t xml:space="preserve">The design template (built)</w:t>
-            </w:r>
-          </w:p>
-        </w:tc>
-        <w:tc>
-          <w:tcPr/>
-          <w:p>
-            <w:pPr>
-              <w:pStyle w:val="Compact"/>
-              <w:jc w:val="left"/>
-            </w:pPr>
-            <w:r>
-              <w:t xml:space="preserve">Thirty minutes: complete the four additions (results-presentation plan, cost-benefit framework, visualisation sketch, evidence-translation plan) in Part 2. PwC: template already built.</w:t>
-            </w:r>
-          </w:p>
-        </w:tc>
-        <w:tc>
-          <w:tcPr/>
-          <w:p>
-            <w:pPr>
-              <w:pStyle w:val="Compact"/>
-              <w:jc w:val="left"/>
-            </w:pPr>
-            <w:r>
-              <w:t xml:space="preserve">Handout built — print only</w:t>
+              <w:t>Design Update template (pack pages 1–3)</w:t>
+            </w:r>
+          </w:p>
+        </w:tc>
+        <w:tc>
+          <w:tcPr/>
+          <w:p>
+            <w:pPr>
+              <w:pStyle w:val="Compact"/>
+              <w:jc w:val="left"/>
+            </w:pPr>
+            <w:r>
+              <w:t>Thirty minutes: complete the four additions (results-presentation plan, cost-benefit framework, visualisation sketch, evidence-translation plan) in Part 2. Print only.</w:t>
+            </w:r>
+          </w:p>
+        </w:tc>
+        <w:tc>
+          <w:tcPr/>
+          <w:p>
+            <w:pPr>
+              <w:pStyle w:val="Compact"/>
+              <w:jc w:val="left"/>
+            </w:pPr>
+            <w:r>
+              <w:t>Built: print</w:t>
             </w:r>
           </w:p>
         </w:tc>
@@ -8133,31 +8413,105 @@
               <w:jc w:val="left"/>
             </w:pPr>
             <w:r>
-              <w:t xml:space="preserve">Timer; optional printed pitch structure and feedback order</w:t>
-            </w:r>
-          </w:p>
-        </w:tc>
-        <w:tc>
-          <w:tcPr/>
-          <w:p>
-            <w:pPr>
-              <w:pStyle w:val="Compact"/>
-              <w:jc w:val="left"/>
-            </w:pPr>
-            <w:r>
-              <w:t xml:space="preserve">Five-minute pitch per team using the timed five-part structure on the slides (limit first), then three minutes of room feedback in a fixed order, written down and aimed at the design not the team. PwC: optional printed pitch-structure and feedback-order cards; both are on the slides.</w:t>
-            </w:r>
-          </w:p>
-        </w:tc>
-        <w:tc>
-          <w:tcPr/>
-          <w:p>
-            <w:pPr>
-              <w:pStyle w:val="Compact"/>
-              <w:jc w:val="left"/>
-            </w:pPr>
-            <w:r>
-              <w:t xml:space="preserve">In slides (cards optional)</w:t>
+              <w:t>Timer; pitch plan (template Part 3); feedback slips (pack page 4), 1 page per participant, cut into four</w:t>
+            </w:r>
+          </w:p>
+        </w:tc>
+        <w:tc>
+          <w:tcPr/>
+          <w:p>
+            <w:pPr>
+              <w:pStyle w:val="Compact"/>
+              <w:jc w:val="left"/>
+            </w:pPr>
+            <w:r>
+              <w:t>Five-minute pitch per team using the timed five-part structure (limit first), planned in Part 3 of the template. Then three minutes of room feedback in the fixed order, written on the feedback slips and handed to the team. Print only.</w:t>
+            </w:r>
+          </w:p>
+        </w:tc>
+        <w:tc>
+          <w:tcPr/>
+          <w:p>
+            <w:pPr>
+              <w:pStyle w:val="Compact"/>
+              <w:jc w:val="left"/>
+            </w:pPr>
+            <w:r>
+              <w:t>Built: print</w:t>
+            </w:r>
+          </w:p>
+        </w:tc>
+      </w:tr>
+      <w:tr>
+        <w:tc>
+          <w:tcPr/>
+          <w:p>
+            <w:pPr>
+              <w:pStyle w:val="Compact"/>
+              <w:jc w:val="left"/>
+            </w:pPr>
+            <w:r>
+              <w:t>Take-away card: the one question</w:t>
+            </w:r>
+          </w:p>
+        </w:tc>
+        <w:tc>
+          <w:tcPr/>
+          <w:p>
+            <w:pPr>
+              <w:pStyle w:val="Compact"/>
+              <w:jc w:val="left"/>
+            </w:pPr>
+            <w:r>
+              <w:t>~1:58 · Section 4, “The one question”</w:t>
+            </w:r>
+          </w:p>
+        </w:tc>
+        <w:tc>
+          <w:tcPr/>
+          <w:p>
+            <w:pPr>
+              <w:pStyle w:val="Compact"/>
+              <w:jc w:val="left"/>
+            </w:pPr>
+            <w:r>
+              <w:t>Handout (take-away)</w:t>
+            </w:r>
+          </w:p>
+        </w:tc>
+        <w:tc>
+          <w:tcPr/>
+          <w:p>
+            <w:pPr>
+              <w:pStyle w:val="Compact"/>
+              <w:jc w:val="left"/>
+            </w:pPr>
+            <w:r>
+              <w:t>Take-away card (pack page 5), 1 per participant, cut</w:t>
+            </w:r>
+          </w:p>
+        </w:tc>
+        <w:tc>
+          <w:tcPr/>
+          <w:p>
+            <w:pPr>
+              <w:pStyle w:val="Compact"/>
+              <w:jc w:val="left"/>
+            </w:pPr>
+            <w:r>
+              <w:t>The week’s one question, with space for the first evaluation decision each participant will make back at their desk. Print only.</w:t>
+            </w:r>
+          </w:p>
+        </w:tc>
+        <w:tc>
+          <w:tcPr/>
+          <w:p>
+            <w:pPr>
+              <w:pStyle w:val="Compact"/>
+              <w:jc w:val="left"/>
+            </w:pPr>
+            <w:r>
+              <w:t>Built: print</w:t>
             </w:r>
           </w:p>
         </w:tc>

</xml_diff>